<commit_message>
Refactor: file names and added documentation, Add: Zenodo downloads count in Github workflow
</commit_message>
<xml_diff>
--- a/data/data-structure-and-instructions.docx
+++ b/data/data-structure-and-instructions.docx
@@ -148,14 +148,7 @@
           <w:b/>
           <w:bCs/>
         </w:rPr>
-        <w:t>quadriga_dashboard_data</w:t>
-      </w:r>
-      <w:r>
-        <w:rPr>
-          <w:b/>
-          <w:bCs/>
-        </w:rPr>
-        <w:t>.xlsx</w:t>
+        <w:t>quadriga_dashboard_data.xlsx</w:t>
       </w:r>
       <w:r>
         <w:t>. For easier tracking, I kept them as separate sheets for now.</w:t>
@@ -284,35 +277,20 @@
     <w:p>
       <w:pPr>
         <w:pStyle w:val="berschrift2"/>
-        <w:rPr>
-          <w:highlight w:val="yellow"/>
-        </w:rPr>
-      </w:pPr>
-      <w:r>
-        <w:rPr>
-          <w:highlight w:val="yellow"/>
-        </w:rPr>
+      </w:pPr>
+      <w:r>
         <w:t xml:space="preserve">Sheet: </w:t>
       </w:r>
       <w:proofErr w:type="spellStart"/>
       <w:r>
-        <w:rPr>
-          <w:highlight w:val="yellow"/>
-        </w:rPr>
         <w:t>Durchgeführte</w:t>
       </w:r>
       <w:proofErr w:type="spellEnd"/>
       <w:r>
-        <w:rPr>
-          <w:highlight w:val="yellow"/>
-        </w:rPr>
         <w:t xml:space="preserve"> externe </w:t>
       </w:r>
       <w:proofErr w:type="spellStart"/>
       <w:r>
-        <w:rPr>
-          <w:highlight w:val="yellow"/>
-        </w:rPr>
         <w:t>Veranstaltungen</w:t>
       </w:r>
       <w:proofErr w:type="spellEnd"/>
@@ -328,7 +306,6 @@
         <w:rPr>
           <w:i/>
           <w:iCs/>
-          <w:highlight w:val="yellow"/>
         </w:rPr>
         <w:t>Purpose: Events that QUADRIGA conducted together with external partners or communities.</w:t>
       </w:r>
@@ -348,10 +325,7 @@
         <w:pStyle w:val="Aufzhlungszeichen"/>
       </w:pPr>
       <w:r>
-        <w:t>Event</w:t>
-      </w:r>
-      <w:r>
-        <w:t xml:space="preserve"> title and date.</w:t>
+        <w:t>Event title and date.</w:t>
       </w:r>
     </w:p>
     <w:p>
@@ -400,43 +374,25 @@
     <w:p>
       <w:pPr>
         <w:pStyle w:val="berschrift2"/>
-        <w:rPr>
-          <w:highlight w:val="yellow"/>
-        </w:rPr>
-      </w:pPr>
-      <w:r>
-        <w:rPr>
-          <w:highlight w:val="yellow"/>
-        </w:rPr>
+      </w:pPr>
+      <w:r>
         <w:lastRenderedPageBreak/>
         <w:t xml:space="preserve">Sheet: </w:t>
       </w:r>
       <w:proofErr w:type="spellStart"/>
       <w:r>
-        <w:rPr>
-          <w:highlight w:val="yellow"/>
-        </w:rPr>
         <w:t>Eigene</w:t>
       </w:r>
       <w:proofErr w:type="spellEnd"/>
       <w:r>
-        <w:rPr>
-          <w:highlight w:val="yellow"/>
-        </w:rPr>
         <w:t xml:space="preserve"> </w:t>
       </w:r>
       <w:proofErr w:type="spellStart"/>
       <w:r>
-        <w:rPr>
-          <w:highlight w:val="yellow"/>
-        </w:rPr>
         <w:t>Beiträge</w:t>
       </w:r>
       <w:proofErr w:type="spellEnd"/>
       <w:r>
-        <w:rPr>
-          <w:highlight w:val="yellow"/>
-        </w:rPr>
         <w:t xml:space="preserve"> extern</w:t>
       </w:r>
     </w:p>
@@ -451,7 +407,6 @@
         <w:rPr>
           <w:i/>
           <w:iCs/>
-          <w:highlight w:val="yellow"/>
         </w:rPr>
         <w:t>Purpose: QUADRIGA’s own contributions (Vorträge, Poster, Panels) at events organised by others.</w:t>
       </w:r>
@@ -508,21 +463,12 @@
     <w:p>
       <w:pPr>
         <w:pStyle w:val="berschrift2"/>
-        <w:rPr>
-          <w:highlight w:val="yellow"/>
-        </w:rPr>
-      </w:pPr>
-      <w:r>
-        <w:rPr>
-          <w:highlight w:val="yellow"/>
-        </w:rPr>
+      </w:pPr>
+      <w:r>
         <w:t xml:space="preserve">Sheet: </w:t>
       </w:r>
       <w:proofErr w:type="spellStart"/>
       <w:r>
-        <w:rPr>
-          <w:highlight w:val="yellow"/>
-        </w:rPr>
         <w:t>Publikationen</w:t>
       </w:r>
       <w:proofErr w:type="spellEnd"/>
@@ -538,7 +484,6 @@
         <w:rPr>
           <w:i/>
           <w:iCs/>
-          <w:highlight w:val="yellow"/>
         </w:rPr>
         <w:t>Purpose:</w:t>
       </w:r>
@@ -546,7 +491,6 @@
         <w:rPr>
           <w:i/>
           <w:iCs/>
-          <w:highlight w:val="yellow"/>
         </w:rPr>
         <w:t xml:space="preserve"> </w:t>
       </w:r>
@@ -554,7 +498,6 @@
         <w:rPr>
           <w:i/>
           <w:iCs/>
-          <w:highlight w:val="yellow"/>
         </w:rPr>
         <w:t>List of</w:t>
       </w:r>
@@ -562,7 +505,6 @@
         <w:rPr>
           <w:i/>
           <w:iCs/>
-          <w:highlight w:val="yellow"/>
         </w:rPr>
         <w:t xml:space="preserve"> all</w:t>
       </w:r>
@@ -570,7 +512,6 @@
         <w:rPr>
           <w:i/>
           <w:iCs/>
-          <w:highlight w:val="yellow"/>
         </w:rPr>
         <w:t xml:space="preserve"> </w:t>
       </w:r>
@@ -579,7 +520,6 @@
         <w:rPr>
           <w:i/>
           <w:iCs/>
-          <w:highlight w:val="yellow"/>
         </w:rPr>
         <w:t>Beitrag</w:t>
       </w:r>
@@ -588,7 +528,6 @@
         <w:rPr>
           <w:i/>
           <w:iCs/>
-          <w:highlight w:val="yellow"/>
         </w:rPr>
         <w:t xml:space="preserve"> or Event or Publication</w:t>
       </w:r>
@@ -1167,49 +1106,28 @@
     <w:p>
       <w:pPr>
         <w:pStyle w:val="berschrift2"/>
-        <w:rPr>
-          <w:highlight w:val="yellow"/>
-        </w:rPr>
-      </w:pPr>
-      <w:r>
-        <w:rPr>
-          <w:highlight w:val="yellow"/>
-        </w:rPr>
+      </w:pPr>
+      <w:r>
         <w:t xml:space="preserve">Sheet: </w:t>
       </w:r>
       <w:proofErr w:type="spellStart"/>
       <w:r>
-        <w:rPr>
-          <w:highlight w:val="yellow"/>
-        </w:rPr>
         <w:t>Teilnahmen</w:t>
       </w:r>
       <w:proofErr w:type="spellEnd"/>
       <w:r>
-        <w:rPr>
-          <w:highlight w:val="yellow"/>
-        </w:rPr>
         <w:t xml:space="preserve"> </w:t>
       </w:r>
       <w:proofErr w:type="gramStart"/>
       <w:r>
-        <w:rPr>
-          <w:highlight w:val="yellow"/>
-        </w:rPr>
         <w:t>an</w:t>
       </w:r>
       <w:proofErr w:type="gramEnd"/>
       <w:r>
-        <w:rPr>
-          <w:highlight w:val="yellow"/>
-        </w:rPr>
         <w:t xml:space="preserve"> </w:t>
       </w:r>
       <w:proofErr w:type="spellStart"/>
       <w:r>
-        <w:rPr>
-          <w:highlight w:val="yellow"/>
-        </w:rPr>
         <w:t>Lernangeboten</w:t>
       </w:r>
       <w:proofErr w:type="spellEnd"/>
@@ -1225,7 +1143,6 @@
         <w:rPr>
           <w:i/>
           <w:iCs/>
-          <w:highlight w:val="yellow"/>
         </w:rPr>
         <w:t>Purpose: Participation of individuals in QUADRIGA learning offers.</w:t>
       </w:r>

</xml_diff>